<commit_message>
Site updated: 2026-01-04 11:38:06
</commit_message>
<xml_diff>
--- a/files/img_proc/实训项目报告模板.docx
+++ b/files/img_proc/实训项目报告模板.docx
@@ -4,6 +4,7 @@
   <w:body>
     <w:p>
       <w:pPr>
+        <w:ind w:firstLineChars="0" w:firstLine="0"/>
         <w:jc w:val="left"/>
       </w:pPr>
       <w:r>
@@ -60,6 +61,7 @@
     <w:p>
       <w:pPr>
         <w:spacing w:beforeLines="800" w:before="2496" w:afterLines="50" w:after="156"/>
+        <w:ind w:firstLineChars="0" w:firstLine="0"/>
         <w:jc w:val="center"/>
         <w:rPr>
           <w:rFonts w:ascii="黑体" w:eastAsia="黑体" w:hAnsi="黑体"/>
@@ -86,6 +88,7 @@
     </w:p>
     <w:p>
       <w:pPr>
+        <w:ind w:firstLineChars="0" w:firstLine="0"/>
         <w:jc w:val="center"/>
         <w:rPr>
           <w:rFonts w:ascii="黑体" w:eastAsia="黑体" w:hAnsi="黑体"/>
@@ -109,7 +112,7 @@
     <w:p>
       <w:pPr>
         <w:spacing w:beforeLines="1150" w:before="3588"/>
-        <w:ind w:leftChars="800" w:left="1680"/>
+        <w:ind w:leftChars="700" w:left="1470" w:firstLineChars="0" w:firstLine="0"/>
         <w:rPr>
           <w:rFonts w:ascii="楷体" w:eastAsia="楷体" w:hAnsi="楷体"/>
           <w:sz w:val="28"/>
@@ -193,12 +196,21 @@
           <w:szCs w:val="32"/>
           <w:u w:val="single"/>
         </w:rPr>
+        <w:t xml:space="preserve">  </w:t>
+      </w:r>
+      <w:r>
+        <w:rPr>
+          <w:rFonts w:ascii="楷体" w:eastAsia="楷体" w:hAnsi="楷体"/>
+          <w:sz w:val="28"/>
+          <w:szCs w:val="32"/>
+          <w:u w:val="single"/>
+        </w:rPr>
         <w:t xml:space="preserve">         </w:t>
       </w:r>
     </w:p>
     <w:p>
       <w:pPr>
-        <w:ind w:leftChars="800" w:left="1680"/>
+        <w:ind w:leftChars="700" w:left="1470" w:firstLineChars="0" w:firstLine="0"/>
         <w:rPr>
           <w:rFonts w:ascii="楷体" w:eastAsia="楷体" w:hAnsi="楷体"/>
           <w:sz w:val="28"/>
@@ -273,14 +285,32 @@
           <w:szCs w:val="32"/>
           <w:u w:val="single"/>
         </w:rPr>
-        <w:t xml:space="preserve">             </w:t>
-      </w:r>
-    </w:p>
-    <w:p>
-      <w:pPr>
-        <w:ind w:leftChars="800" w:left="1680"/>
-        <w:rPr>
-          <w:rFonts w:ascii="楷体" w:eastAsia="楷体" w:hAnsi="楷体" w:hint="eastAsia"/>
+        <w:t xml:space="preserve">  </w:t>
+      </w:r>
+      <w:r>
+        <w:rPr>
+          <w:rFonts w:ascii="楷体" w:eastAsia="楷体" w:hAnsi="楷体"/>
+          <w:sz w:val="28"/>
+          <w:szCs w:val="32"/>
+          <w:u w:val="single"/>
+        </w:rPr>
+        <w:t xml:space="preserve">  </w:t>
+      </w:r>
+      <w:r>
+        <w:rPr>
+          <w:rFonts w:ascii="楷体" w:eastAsia="楷体" w:hAnsi="楷体"/>
+          <w:sz w:val="28"/>
+          <w:szCs w:val="32"/>
+          <w:u w:val="single"/>
+        </w:rPr>
+        <w:t xml:space="preserve">           </w:t>
+      </w:r>
+    </w:p>
+    <w:p>
+      <w:pPr>
+        <w:ind w:leftChars="700" w:left="1470" w:firstLineChars="0" w:firstLine="0"/>
+        <w:rPr>
+          <w:rFonts w:ascii="楷体" w:eastAsia="楷体" w:hAnsi="楷体"/>
           <w:sz w:val="28"/>
           <w:szCs w:val="32"/>
         </w:rPr>
@@ -352,12 +382,30 @@
           <w:szCs w:val="32"/>
           <w:u w:val="single"/>
         </w:rPr>
-        <w:t xml:space="preserve">             </w:t>
-      </w:r>
-    </w:p>
-    <w:p>
-      <w:pPr>
-        <w:ind w:leftChars="800" w:left="1680"/>
+        <w:t xml:space="preserve">  </w:t>
+      </w:r>
+      <w:r>
+        <w:rPr>
+          <w:rFonts w:ascii="楷体" w:eastAsia="楷体" w:hAnsi="楷体"/>
+          <w:sz w:val="28"/>
+          <w:szCs w:val="32"/>
+          <w:u w:val="single"/>
+        </w:rPr>
+        <w:t xml:space="preserve">  </w:t>
+      </w:r>
+      <w:r>
+        <w:rPr>
+          <w:rFonts w:ascii="楷体" w:eastAsia="楷体" w:hAnsi="楷体"/>
+          <w:sz w:val="28"/>
+          <w:szCs w:val="32"/>
+          <w:u w:val="single"/>
+        </w:rPr>
+        <w:t xml:space="preserve">           </w:t>
+      </w:r>
+    </w:p>
+    <w:p>
+      <w:pPr>
+        <w:ind w:leftChars="700" w:left="1470" w:firstLineChars="0" w:firstLine="0"/>
         <w:rPr>
           <w:rFonts w:ascii="楷体" w:eastAsia="楷体" w:hAnsi="楷体"/>
           <w:sz w:val="28"/>
@@ -407,6 +455,96 @@
           <w:szCs w:val="32"/>
           <w:u w:val="single"/>
         </w:rPr>
+        <w:t xml:space="preserve">   </w:t>
+      </w:r>
+      <w:r>
+        <w:rPr>
+          <w:rFonts w:ascii="楷体" w:eastAsia="楷体" w:hAnsi="楷体"/>
+          <w:sz w:val="28"/>
+          <w:szCs w:val="32"/>
+          <w:u w:val="single"/>
+        </w:rPr>
+        <w:t xml:space="preserve">  </w:t>
+      </w:r>
+      <w:r>
+        <w:rPr>
+          <w:rFonts w:ascii="楷体" w:eastAsia="楷体" w:hAnsi="楷体"/>
+          <w:sz w:val="28"/>
+          <w:szCs w:val="32"/>
+          <w:u w:val="single"/>
+        </w:rPr>
+        <w:t xml:space="preserve"> </w:t>
+      </w:r>
+      <w:r>
+        <w:rPr>
+          <w:rFonts w:ascii="楷体" w:eastAsia="楷体" w:hAnsi="楷体"/>
+          <w:sz w:val="28"/>
+          <w:szCs w:val="32"/>
+          <w:u w:val="single"/>
+        </w:rPr>
+        <w:t xml:space="preserve">            </w:t>
+      </w:r>
+    </w:p>
+    <w:p>
+      <w:pPr>
+        <w:ind w:leftChars="700" w:left="1470" w:firstLineChars="0" w:firstLine="0"/>
+        <w:rPr>
+          <w:rFonts w:ascii="楷体" w:eastAsia="楷体" w:hAnsi="楷体"/>
+          <w:sz w:val="28"/>
+          <w:szCs w:val="32"/>
+          <w:u w:val="single"/>
+        </w:rPr>
+      </w:pPr>
+      <w:r>
+        <w:rPr>
+          <w:rFonts w:ascii="楷体" w:eastAsia="楷体" w:hAnsi="楷体" w:hint="eastAsia"/>
+          <w:sz w:val="28"/>
+          <w:szCs w:val="32"/>
+        </w:rPr>
+        <w:t>日　　期</w:t>
+      </w:r>
+      <w:r>
+        <w:rPr>
+          <w:rFonts w:ascii="楷体" w:eastAsia="楷体" w:hAnsi="楷体" w:hint="eastAsia"/>
+          <w:sz w:val="28"/>
+          <w:szCs w:val="32"/>
+        </w:rPr>
+        <w:t>：</w:t>
+      </w:r>
+      <w:r>
+        <w:rPr>
+          <w:rFonts w:ascii="楷体" w:eastAsia="楷体" w:hAnsi="楷体" w:hint="eastAsia"/>
+          <w:sz w:val="28"/>
+          <w:szCs w:val="32"/>
+          <w:u w:val="single"/>
+        </w:rPr>
+        <w:t xml:space="preserve"> </w:t>
+      </w:r>
+      <w:r>
+        <w:rPr>
+          <w:rFonts w:ascii="楷体" w:eastAsia="楷体" w:hAnsi="楷体"/>
+          <w:sz w:val="28"/>
+          <w:szCs w:val="32"/>
+          <w:u w:val="single"/>
+        </w:rPr>
+        <w:t xml:space="preserve">       </w:t>
+      </w:r>
+      <w:r>
+        <w:rPr>
+          <w:rFonts w:ascii="楷体" w:eastAsia="楷体" w:hAnsi="楷体" w:hint="eastAsia"/>
+          <w:sz w:val="28"/>
+          <w:szCs w:val="32"/>
+          <w:u w:val="single"/>
+        </w:rPr>
+        <w:t xml:space="preserve"> </w:t>
+      </w:r>
+      <w:r>
+        <w:rPr>
+          <w:rFonts w:ascii="楷体" w:eastAsia="楷体" w:hAnsi="楷体"/>
+          <w:sz w:val="28"/>
+          <w:szCs w:val="32"/>
+          <w:u w:val="single"/>
+        </w:rPr>
         <w:t xml:space="preserve">    </w:t>
       </w:r>
       <w:r>
@@ -416,84 +554,21 @@
           <w:szCs w:val="32"/>
           <w:u w:val="single"/>
         </w:rPr>
+        <w:t xml:space="preserve">  </w:t>
+      </w:r>
+      <w:r>
+        <w:rPr>
+          <w:rFonts w:ascii="楷体" w:eastAsia="楷体" w:hAnsi="楷体"/>
+          <w:sz w:val="28"/>
+          <w:szCs w:val="32"/>
+          <w:u w:val="single"/>
+        </w:rPr>
         <w:t xml:space="preserve">            </w:t>
       </w:r>
     </w:p>
     <w:p>
       <w:pPr>
-        <w:ind w:leftChars="800" w:left="1680"/>
-        <w:rPr>
-          <w:rFonts w:ascii="楷体" w:eastAsia="楷体" w:hAnsi="楷体"/>
-          <w:sz w:val="28"/>
-          <w:szCs w:val="32"/>
-          <w:u w:val="single"/>
-        </w:rPr>
-      </w:pPr>
-      <w:r>
-        <w:rPr>
-          <w:rFonts w:ascii="楷体" w:eastAsia="楷体" w:hAnsi="楷体" w:hint="eastAsia"/>
-          <w:sz w:val="28"/>
-          <w:szCs w:val="32"/>
-        </w:rPr>
-        <w:t>日　　期</w:t>
-      </w:r>
-      <w:r>
-        <w:rPr>
-          <w:rFonts w:ascii="楷体" w:eastAsia="楷体" w:hAnsi="楷体" w:hint="eastAsia"/>
-          <w:sz w:val="28"/>
-          <w:szCs w:val="32"/>
-        </w:rPr>
-        <w:t>：</w:t>
-      </w:r>
-      <w:r>
-        <w:rPr>
-          <w:rFonts w:ascii="楷体" w:eastAsia="楷体" w:hAnsi="楷体" w:hint="eastAsia"/>
-          <w:sz w:val="28"/>
-          <w:szCs w:val="32"/>
-          <w:u w:val="single"/>
-        </w:rPr>
-        <w:t xml:space="preserve"> </w:t>
-      </w:r>
-      <w:r>
-        <w:rPr>
-          <w:rFonts w:ascii="楷体" w:eastAsia="楷体" w:hAnsi="楷体"/>
-          <w:sz w:val="28"/>
-          <w:szCs w:val="32"/>
-          <w:u w:val="single"/>
-        </w:rPr>
-        <w:t xml:space="preserve">       </w:t>
-      </w:r>
-      <w:r>
-        <w:rPr>
-          <w:rFonts w:ascii="楷体" w:eastAsia="楷体" w:hAnsi="楷体" w:hint="eastAsia"/>
-          <w:sz w:val="28"/>
-          <w:szCs w:val="32"/>
-          <w:u w:val="single"/>
-        </w:rPr>
-        <w:t xml:space="preserve"> </w:t>
-      </w:r>
-      <w:r>
-        <w:rPr>
-          <w:rFonts w:ascii="楷体" w:eastAsia="楷体" w:hAnsi="楷体"/>
-          <w:sz w:val="28"/>
-          <w:szCs w:val="32"/>
-          <w:u w:val="single"/>
-        </w:rPr>
-        <w:t xml:space="preserve">    </w:t>
-      </w:r>
-      <w:r>
-        <w:rPr>
-          <w:rFonts w:ascii="楷体" w:eastAsia="楷体" w:hAnsi="楷体"/>
-          <w:sz w:val="28"/>
-          <w:szCs w:val="32"/>
-          <w:u w:val="single"/>
-        </w:rPr>
-        <w:t xml:space="preserve">            </w:t>
-      </w:r>
-    </w:p>
-    <w:p>
-      <w:pPr>
-        <w:ind w:leftChars="1000" w:left="2100"/>
+        <w:ind w:leftChars="1000" w:left="2100" w:firstLineChars="0" w:firstLine="0"/>
         <w:rPr>
           <w:rFonts w:ascii="楷体" w:eastAsia="楷体" w:hAnsi="楷体"/>
           <w:sz w:val="28"/>
@@ -505,6 +580,7 @@
     <w:p>
       <w:pPr>
         <w:widowControl/>
+        <w:ind w:firstLine="560"/>
         <w:jc w:val="left"/>
         <w:rPr>
           <w:rFonts w:ascii="楷体" w:eastAsia="楷体" w:hAnsi="楷体"/>
@@ -523,132 +599,265 @@
     </w:p>
     <w:p>
       <w:pPr>
-        <w:spacing w:line="312" w:lineRule="auto"/>
-        <w:rPr>
-          <w:rFonts w:ascii="黑体" w:eastAsia="黑体" w:hAnsi="黑体"/>
-          <w:sz w:val="28"/>
-          <w:szCs w:val="32"/>
-        </w:rPr>
-      </w:pPr>
-      <w:r>
-        <w:rPr>
-          <w:rFonts w:ascii="黑体" w:eastAsia="黑体" w:hAnsi="黑体" w:hint="eastAsia"/>
-          <w:sz w:val="28"/>
-          <w:szCs w:val="32"/>
+        <w:pStyle w:val="1"/>
+      </w:pPr>
+      <w:r>
+        <w:rPr>
+          <w:rFonts w:hint="eastAsia"/>
         </w:rPr>
         <w:lastRenderedPageBreak/>
-        <w:t>一、项目介绍</w:t>
-      </w:r>
-    </w:p>
-    <w:p>
-      <w:pPr>
-        <w:spacing w:line="312" w:lineRule="auto"/>
-        <w:rPr>
-          <w:rFonts w:ascii="Times New Roman" w:eastAsia="宋体" w:hAnsi="Times New Roman" w:cs="Times New Roman"/>
-          <w:sz w:val="24"/>
-          <w:szCs w:val="24"/>
-        </w:rPr>
-      </w:pPr>
-    </w:p>
-    <w:p>
-      <w:pPr>
-        <w:spacing w:line="312" w:lineRule="auto"/>
-        <w:rPr>
-          <w:rFonts w:ascii="黑体" w:eastAsia="黑体" w:hAnsi="黑体"/>
-          <w:sz w:val="28"/>
-          <w:szCs w:val="32"/>
-        </w:rPr>
-      </w:pPr>
-      <w:r>
-        <w:rPr>
-          <w:rFonts w:ascii="黑体" w:eastAsia="黑体" w:hAnsi="黑体" w:hint="eastAsia"/>
-          <w:sz w:val="28"/>
-          <w:szCs w:val="32"/>
+        <w:t>摘要</w:t>
+      </w:r>
+    </w:p>
+    <w:p>
+      <w:pPr>
+        <w:ind w:firstLine="420"/>
+        <w:rPr>
+          <w:rFonts w:hint="eastAsia"/>
+        </w:rPr>
+      </w:pPr>
+      <w:r>
+        <w:rPr>
+          <w:rFonts w:hint="eastAsia"/>
+        </w:rPr>
+        <w:t>（项目</w:t>
+      </w:r>
+      <w:r>
+        <w:rPr>
+          <w:rFonts w:hint="eastAsia"/>
+        </w:rPr>
+        <w:t>简介</w:t>
+      </w:r>
+      <w:r>
+        <w:rPr>
+          <w:rFonts w:hint="eastAsia"/>
+        </w:rPr>
+        <w:t>）</w:t>
+      </w:r>
+    </w:p>
+    <w:p>
+      <w:pPr>
+        <w:pStyle w:val="1"/>
+      </w:pPr>
+      <w:r>
+        <w:rPr>
+          <w:rFonts w:hint="eastAsia"/>
+        </w:rPr>
+        <w:t>一、项目</w:t>
+      </w:r>
+      <w:r>
+        <w:rPr>
+          <w:rFonts w:hint="eastAsia"/>
+        </w:rPr>
+        <w:t>背景与要解决的主要问题</w:t>
+      </w:r>
+    </w:p>
+    <w:p>
+      <w:pPr>
+        <w:ind w:firstLine="420"/>
+      </w:pPr>
+      <w:r>
+        <w:rPr>
+          <w:rFonts w:hint="eastAsia"/>
+        </w:rPr>
+        <w:t>（</w:t>
+      </w:r>
+      <w:r>
+        <w:rPr>
+          <w:rFonts w:hint="eastAsia"/>
+        </w:rPr>
+        <w:t>为什么要选择该题目，项目解决的</w:t>
+      </w:r>
+      <w:r>
+        <w:rPr>
+          <w:rFonts w:hint="eastAsia"/>
+        </w:rPr>
+        <w:t>核心问题</w:t>
+      </w:r>
+      <w:r>
+        <w:rPr>
+          <w:rFonts w:hint="eastAsia"/>
+        </w:rPr>
+        <w:t>是什么</w:t>
+      </w:r>
+      <w:r>
+        <w:rPr>
+          <w:rFonts w:hint="eastAsia"/>
+        </w:rPr>
+        <w:t>）</w:t>
+      </w:r>
+    </w:p>
+    <w:p>
+      <w:pPr>
+        <w:pStyle w:val="1"/>
+      </w:pPr>
+      <w:r>
+        <w:rPr>
+          <w:rFonts w:hint="eastAsia"/>
         </w:rPr>
         <w:t>二、</w:t>
       </w:r>
       <w:r>
         <w:rPr>
-          <w:rFonts w:ascii="黑体" w:eastAsia="黑体" w:hAnsi="黑体" w:hint="eastAsia"/>
-          <w:sz w:val="28"/>
-          <w:szCs w:val="32"/>
+          <w:rFonts w:hint="eastAsia"/>
+        </w:rPr>
+        <w:t>关键技术选型</w:t>
+      </w:r>
+    </w:p>
+    <w:p>
+      <w:pPr>
+        <w:ind w:firstLine="420"/>
+      </w:pPr>
+      <w:r>
+        <w:rPr>
+          <w:rFonts w:hint="eastAsia"/>
+        </w:rPr>
+        <w:t>（对项目用到的主要技术进行阐述）</w:t>
+      </w:r>
+    </w:p>
+    <w:p>
+      <w:pPr>
+        <w:pStyle w:val="1"/>
+      </w:pPr>
+      <w:r>
+        <w:rPr>
+          <w:rFonts w:hint="eastAsia"/>
+        </w:rPr>
+        <w:t>三</w:t>
+      </w:r>
+      <w:r>
+        <w:rPr>
+          <w:rFonts w:hint="eastAsia"/>
+        </w:rPr>
+        <w:t>、</w:t>
+      </w:r>
+      <w:r>
+        <w:rPr>
+          <w:rFonts w:hint="eastAsia"/>
         </w:rPr>
         <w:t>系统设计与实现</w:t>
       </w:r>
     </w:p>
     <w:p>
       <w:pPr>
-        <w:spacing w:line="312" w:lineRule="auto"/>
-        <w:rPr>
-          <w:rFonts w:ascii="Times New Roman" w:eastAsia="宋体" w:hAnsi="Times New Roman" w:cs="Times New Roman"/>
-          <w:sz w:val="24"/>
-          <w:szCs w:val="24"/>
-        </w:rPr>
-      </w:pPr>
-    </w:p>
-    <w:p>
-      <w:pPr>
-        <w:spacing w:line="312" w:lineRule="auto"/>
-        <w:rPr>
-          <w:rFonts w:ascii="黑体" w:eastAsia="黑体" w:hAnsi="黑体"/>
-          <w:sz w:val="28"/>
-          <w:szCs w:val="32"/>
-        </w:rPr>
-      </w:pPr>
-      <w:r>
-        <w:rPr>
-          <w:rFonts w:ascii="黑体" w:eastAsia="黑体" w:hAnsi="黑体" w:hint="eastAsia"/>
-          <w:sz w:val="28"/>
-          <w:szCs w:val="32"/>
-        </w:rPr>
-        <w:t>三、项目运行结果</w:t>
-      </w:r>
-    </w:p>
-    <w:p>
-      <w:pPr>
-        <w:spacing w:line="312" w:lineRule="auto"/>
-        <w:rPr>
-          <w:rFonts w:ascii="Times New Roman" w:eastAsia="宋体" w:hAnsi="Times New Roman" w:cs="Times New Roman"/>
-          <w:sz w:val="24"/>
-          <w:szCs w:val="24"/>
-        </w:rPr>
-      </w:pPr>
-    </w:p>
-    <w:p>
-      <w:pPr>
-        <w:spacing w:line="312" w:lineRule="auto"/>
-        <w:rPr>
-          <w:rFonts w:ascii="黑体" w:eastAsia="黑体" w:hAnsi="黑体"/>
-          <w:sz w:val="28"/>
-          <w:szCs w:val="32"/>
-        </w:rPr>
-      </w:pPr>
-      <w:r>
-        <w:rPr>
-          <w:rFonts w:ascii="黑体" w:eastAsia="黑体" w:hAnsi="黑体" w:hint="eastAsia"/>
-          <w:sz w:val="28"/>
-          <w:szCs w:val="32"/>
-        </w:rPr>
-        <w:t>四、</w:t>
-      </w:r>
-      <w:r>
-        <w:rPr>
-          <w:rFonts w:ascii="黑体" w:eastAsia="黑体" w:hAnsi="黑体" w:hint="eastAsia"/>
-          <w:sz w:val="28"/>
-          <w:szCs w:val="32"/>
+        <w:ind w:firstLine="420"/>
+      </w:pPr>
+      <w:r>
+        <w:rPr>
+          <w:rFonts w:hint="eastAsia"/>
+        </w:rPr>
+        <w:t>（</w:t>
+      </w:r>
+      <w:r>
+        <w:rPr>
+          <w:rFonts w:hint="eastAsia"/>
+        </w:rPr>
+        <w:t>详述系统的架构设计、核心模块功能以及具体的实现方案</w:t>
+      </w:r>
+      <w:r>
+        <w:rPr>
+          <w:rFonts w:hint="eastAsia"/>
+        </w:rPr>
+        <w:t>。对于重要的代码可以列出，但只需要给出关键部分即可，不要大段粘贴代码）</w:t>
+      </w:r>
+    </w:p>
+    <w:p>
+      <w:pPr>
+        <w:pStyle w:val="1"/>
+      </w:pPr>
+      <w:r>
+        <w:rPr>
+          <w:rFonts w:hint="eastAsia"/>
+        </w:rPr>
+        <w:t>四</w:t>
+      </w:r>
+      <w:r>
+        <w:rPr>
+          <w:rFonts w:hint="eastAsia"/>
+        </w:rPr>
+        <w:t>、项目运行结果</w:t>
+      </w:r>
+      <w:r>
+        <w:rPr>
+          <w:rFonts w:hint="eastAsia"/>
+        </w:rPr>
+        <w:t>展示</w:t>
+      </w:r>
+    </w:p>
+    <w:p>
+      <w:pPr>
+        <w:ind w:firstLine="420"/>
+      </w:pPr>
+      <w:r>
+        <w:rPr>
+          <w:rFonts w:hint="eastAsia"/>
+        </w:rPr>
+        <w:t>（</w:t>
+      </w:r>
+      <w:r>
+        <w:rPr>
+          <w:rFonts w:hint="eastAsia"/>
+        </w:rPr>
+        <w:t>展示项目运行效果，</w:t>
+      </w:r>
+      <w:r>
+        <w:rPr>
+          <w:rFonts w:hint="eastAsia"/>
+        </w:rPr>
+        <w:t>贴出运行结果图片，如有需要可以对算法指标进行量化分析</w:t>
+      </w:r>
+      <w:r>
+        <w:rPr>
+          <w:rFonts w:hint="eastAsia"/>
+        </w:rPr>
+        <w:t>）</w:t>
+      </w:r>
+    </w:p>
+    <w:p>
+      <w:pPr>
+        <w:pStyle w:val="1"/>
+      </w:pPr>
+      <w:r>
+        <w:rPr>
+          <w:rFonts w:hint="eastAsia"/>
+        </w:rPr>
+        <w:t>五</w:t>
+      </w:r>
+      <w:r>
+        <w:rPr>
+          <w:rFonts w:hint="eastAsia"/>
+        </w:rPr>
+        <w:t>、</w:t>
+      </w:r>
+      <w:r>
+        <w:rPr>
+          <w:rFonts w:hint="eastAsia"/>
         </w:rPr>
         <w:t>小组成员分工情况</w:t>
       </w:r>
     </w:p>
     <w:p>
       <w:pPr>
-        <w:spacing w:line="312" w:lineRule="auto"/>
-        <w:rPr>
-          <w:rFonts w:ascii="Times New Roman" w:eastAsia="宋体" w:hAnsi="Times New Roman" w:cs="Times New Roman"/>
-          <w:sz w:val="28"/>
-          <w:szCs w:val="32"/>
-        </w:rPr>
-      </w:pPr>
+        <w:ind w:firstLine="420"/>
+      </w:pPr>
+      <w:r>
+        <w:rPr>
+          <w:rFonts w:hint="eastAsia"/>
+        </w:rPr>
+        <w:t>（</w:t>
+      </w:r>
+      <w:r>
+        <w:rPr>
+          <w:rFonts w:hint="eastAsia"/>
+        </w:rPr>
+        <w:t>清晰说明各成员在项目中的具体职责与主要贡献</w:t>
+      </w:r>
+      <w:r>
+        <w:rPr>
+          <w:rFonts w:hint="eastAsia"/>
+        </w:rPr>
+        <w:t>）</w:t>
+      </w:r>
     </w:p>
     <w:sectPr>
       <w:headerReference w:type="default" r:id="rId7"/>
@@ -669,6 +878,9 @@
 <w:endnotes xmlns:wpc="http://schemas.microsoft.com/office/word/2010/wordprocessingCanvas" xmlns:cx="http://schemas.microsoft.com/office/drawing/2014/chartex" xmlns:cx1="http://schemas.microsoft.com/office/drawing/2015/9/8/chartex" xmlns:cx2="http://schemas.microsoft.com/office/drawing/2015/10/21/chartex" xmlns:cx3="http://schemas.microsoft.com/office/drawing/2016/5/9/chartex" xmlns:cx4="http://schemas.microsoft.com/office/drawing/2016/5/10/chartex" xmlns:cx5="http://schemas.microsoft.com/office/drawing/2016/5/11/chartex" xmlns:cx6="http://schemas.microsoft.com/office/drawing/2016/5/12/chartex" xmlns:cx7="http://schemas.microsoft.com/office/drawing/2016/5/13/chartex" xmlns:cx8="http://schemas.microsoft.com/office/drawing/2016/5/14/chartex" xmlns:mc="http://schemas.openxmlformats.org/markup-compatibility/2006" xmlns:aink="http://schemas.microsoft.com/office/drawing/2016/ink" xmlns:am3d="http://schemas.microsoft.com/office/drawing/2017/model3d" xmlns:o="urn:schemas-microsoft-com:office:office" xmlns:r="http://schemas.openxmlformats.org/officeDocument/2006/relationships" xmlns:m="http://schemas.openxmlformats.org/officeDocument/2006/math" xmlns:v="urn:schemas-microsoft-com:vml" xmlns:wp14="http://schemas.microsoft.com/office/word/2010/wordprocessingDrawing" xmlns:wp="http://schemas.openxmlformats.org/drawingml/2006/wordprocessingDrawing" xmlns:w10="urn:schemas-microsoft-com:office:word" xmlns:w="http://schemas.openxmlformats.org/wordprocessingml/2006/main" xmlns:w14="http://schemas.microsoft.com/office/word/2010/wordml" xmlns:w15="http://schemas.microsoft.com/office/word/2012/wordml" xmlns:w16cex="http://schemas.microsoft.com/office/word/2018/wordml/cex" xmlns:w16cid="http://schemas.microsoft.com/office/word/2016/wordml/cid" xmlns:w16="http://schemas.microsoft.com/office/word/2018/wordml" xmlns:w16sdtdh="http://schemas.microsoft.com/office/word/2020/wordml/sdtdatahash" xmlns:w16se="http://schemas.microsoft.com/office/word/2015/wordml/symex" xmlns:wpg="http://schemas.microsoft.com/office/word/2010/wordprocessingGroup" xmlns:wpi="http://schemas.microsoft.com/office/word/2010/wordprocessingInk" xmlns:wne="http://schemas.microsoft.com/office/word/2006/wordml" xmlns:wps="http://schemas.microsoft.com/office/word/2010/wordprocessingShape" mc:Ignorable="w14 w15 w16se w16cid w16 w16cex w16sdtdh wp14">
   <w:endnote w:type="separator" w:id="-1">
     <w:p>
+      <w:pPr>
+        <w:ind w:firstLine="420"/>
+      </w:pPr>
       <w:r>
         <w:separator/>
       </w:r>
@@ -676,6 +888,9 @@
   </w:endnote>
   <w:endnote w:type="continuationSeparator" w:id="0">
     <w:p>
+      <w:pPr>
+        <w:ind w:firstLine="420"/>
+      </w:pPr>
       <w:r>
         <w:continuationSeparator/>
       </w:r>
@@ -689,7 +904,7 @@
   <w:sdt>
     <w:sdtPr>
       <w:rPr>
-        <w:rFonts w:ascii="Times New Roman" w:hAnsi="Times New Roman" w:cs="Times New Roman"/>
+        <w:rFonts w:cs="Times New Roman"/>
       </w:rPr>
       <w:id w:val="1674772489"/>
       <w:docPartObj>
@@ -702,39 +917,40 @@
       <w:p>
         <w:pPr>
           <w:pStyle w:val="a5"/>
+          <w:ind w:firstLine="360"/>
           <w:jc w:val="center"/>
           <w:rPr>
-            <w:rFonts w:ascii="Times New Roman" w:hAnsi="Times New Roman" w:cs="Times New Roman"/>
+            <w:rFonts w:cs="Times New Roman"/>
           </w:rPr>
         </w:pPr>
         <w:r>
           <w:rPr>
-            <w:rFonts w:ascii="Times New Roman" w:hAnsi="Times New Roman" w:cs="Times New Roman"/>
+            <w:rFonts w:cs="Times New Roman"/>
           </w:rPr>
           <w:fldChar w:fldCharType="begin"/>
         </w:r>
         <w:r>
           <w:rPr>
-            <w:rFonts w:ascii="Times New Roman" w:hAnsi="Times New Roman" w:cs="Times New Roman"/>
+            <w:rFonts w:cs="Times New Roman"/>
           </w:rPr>
           <w:instrText>PAGE   \* MERGEFORMAT</w:instrText>
         </w:r>
         <w:r>
           <w:rPr>
-            <w:rFonts w:ascii="Times New Roman" w:hAnsi="Times New Roman" w:cs="Times New Roman"/>
+            <w:rFonts w:cs="Times New Roman"/>
           </w:rPr>
           <w:fldChar w:fldCharType="separate"/>
         </w:r>
         <w:r>
           <w:rPr>
-            <w:rFonts w:ascii="Times New Roman" w:hAnsi="Times New Roman" w:cs="Times New Roman"/>
+            <w:rFonts w:cs="Times New Roman"/>
             <w:lang w:val="zh-CN"/>
           </w:rPr>
           <w:t>2</w:t>
         </w:r>
         <w:r>
           <w:rPr>
-            <w:rFonts w:ascii="Times New Roman" w:hAnsi="Times New Roman" w:cs="Times New Roman"/>
+            <w:rFonts w:cs="Times New Roman"/>
           </w:rPr>
           <w:fldChar w:fldCharType="end"/>
         </w:r>
@@ -744,8 +960,9 @@
   <w:p>
     <w:pPr>
       <w:pStyle w:val="a5"/>
+      <w:ind w:firstLine="360"/>
       <w:rPr>
-        <w:rFonts w:ascii="Times New Roman" w:hAnsi="Times New Roman" w:cs="Times New Roman"/>
+        <w:rFonts w:cs="Times New Roman"/>
       </w:rPr>
     </w:pPr>
   </w:p>
@@ -756,6 +973,9 @@
 <w:footnotes xmlns:wpc="http://schemas.microsoft.com/office/word/2010/wordprocessingCanvas" xmlns:cx="http://schemas.microsoft.com/office/drawing/2014/chartex" xmlns:cx1="http://schemas.microsoft.com/office/drawing/2015/9/8/chartex" xmlns:cx2="http://schemas.microsoft.com/office/drawing/2015/10/21/chartex" xmlns:cx3="http://schemas.microsoft.com/office/drawing/2016/5/9/chartex" xmlns:cx4="http://schemas.microsoft.com/office/drawing/2016/5/10/chartex" xmlns:cx5="http://schemas.microsoft.com/office/drawing/2016/5/11/chartex" xmlns:cx6="http://schemas.microsoft.com/office/drawing/2016/5/12/chartex" xmlns:cx7="http://schemas.microsoft.com/office/drawing/2016/5/13/chartex" xmlns:cx8="http://schemas.microsoft.com/office/drawing/2016/5/14/chartex" xmlns:mc="http://schemas.openxmlformats.org/markup-compatibility/2006" xmlns:aink="http://schemas.microsoft.com/office/drawing/2016/ink" xmlns:am3d="http://schemas.microsoft.com/office/drawing/2017/model3d" xmlns:o="urn:schemas-microsoft-com:office:office" xmlns:r="http://schemas.openxmlformats.org/officeDocument/2006/relationships" xmlns:m="http://schemas.openxmlformats.org/officeDocument/2006/math" xmlns:v="urn:schemas-microsoft-com:vml" xmlns:wp14="http://schemas.microsoft.com/office/word/2010/wordprocessingDrawing" xmlns:wp="http://schemas.openxmlformats.org/drawingml/2006/wordprocessingDrawing" xmlns:w10="urn:schemas-microsoft-com:office:word" xmlns:w="http://schemas.openxmlformats.org/wordprocessingml/2006/main" xmlns:w14="http://schemas.microsoft.com/office/word/2010/wordml" xmlns:w15="http://schemas.microsoft.com/office/word/2012/wordml" xmlns:w16cex="http://schemas.microsoft.com/office/word/2018/wordml/cex" xmlns:w16cid="http://schemas.microsoft.com/office/word/2016/wordml/cid" xmlns:w16="http://schemas.microsoft.com/office/word/2018/wordml" xmlns:w16sdtdh="http://schemas.microsoft.com/office/word/2020/wordml/sdtdatahash" xmlns:w16se="http://schemas.microsoft.com/office/word/2015/wordml/symex" xmlns:wpg="http://schemas.microsoft.com/office/word/2010/wordprocessingGroup" xmlns:wpi="http://schemas.microsoft.com/office/word/2010/wordprocessingInk" xmlns:wne="http://schemas.microsoft.com/office/word/2006/wordml" xmlns:wps="http://schemas.microsoft.com/office/word/2010/wordprocessingShape" mc:Ignorable="w14 w15 w16se w16cid w16 w16cex w16sdtdh wp14">
   <w:footnote w:type="separator" w:id="-1">
     <w:p>
+      <w:pPr>
+        <w:ind w:firstLine="420"/>
+      </w:pPr>
       <w:r>
         <w:separator/>
       </w:r>
@@ -763,6 +983,9 @@
   </w:footnote>
   <w:footnote w:type="continuationSeparator" w:id="0">
     <w:p>
+      <w:pPr>
+        <w:ind w:firstLine="420"/>
+      </w:pPr>
       <w:r>
         <w:continuationSeparator/>
       </w:r>
@@ -776,13 +999,14 @@
   <w:p>
     <w:pPr>
       <w:pStyle w:val="a3"/>
+      <w:ind w:firstLine="360"/>
       <w:rPr>
-        <w:rFonts w:ascii="宋体" w:eastAsia="宋体" w:hAnsi="宋体"/>
+        <w:rFonts w:ascii="宋体" w:hAnsi="宋体"/>
       </w:rPr>
     </w:pPr>
     <w:r>
       <w:rPr>
-        <w:rFonts w:ascii="宋体" w:eastAsia="宋体" w:hAnsi="宋体" w:hint="eastAsia"/>
+        <w:rFonts w:ascii="宋体" w:hAnsi="宋体" w:hint="eastAsia"/>
       </w:rPr>
       <w:t>数字图像处理综合实训</w:t>
     </w:r>
@@ -798,6 +1022,7 @@
       <w:pBdr>
         <w:bottom w:val="none" w:sz="0" w:space="0" w:color="auto"/>
       </w:pBdr>
+      <w:ind w:firstLine="360"/>
     </w:pPr>
   </w:p>
 </w:hdr>
@@ -1198,10 +1423,35 @@
   <w:style w:type="paragraph" w:default="1" w:styleId="a">
     <w:name w:val="Normal"/>
     <w:qFormat/>
+    <w:rsid w:val="00621A96"/>
     <w:pPr>
       <w:widowControl w:val="0"/>
+      <w:spacing w:line="288" w:lineRule="auto"/>
+      <w:ind w:firstLineChars="200" w:firstLine="200"/>
       <w:jc w:val="both"/>
     </w:pPr>
+    <w:rPr>
+      <w:rFonts w:ascii="Times New Roman" w:eastAsia="宋体" w:hAnsi="Times New Roman"/>
+    </w:rPr>
+  </w:style>
+  <w:style w:type="paragraph" w:styleId="1">
+    <w:name w:val="heading 1"/>
+    <w:basedOn w:val="a"/>
+    <w:next w:val="a"/>
+    <w:link w:val="10"/>
+    <w:uiPriority w:val="9"/>
+    <w:qFormat/>
+    <w:rsid w:val="00D124F9"/>
+    <w:pPr>
+      <w:spacing w:line="312" w:lineRule="auto"/>
+      <w:ind w:firstLineChars="0" w:firstLine="0"/>
+      <w:outlineLvl w:val="0"/>
+    </w:pPr>
+    <w:rPr>
+      <w:rFonts w:ascii="黑体" w:eastAsia="黑体" w:hAnsi="黑体"/>
+      <w:sz w:val="28"/>
+      <w:szCs w:val="32"/>
+    </w:rPr>
   </w:style>
   <w:style w:type="character" w:default="1" w:styleId="a0">
     <w:name w:val="Default Paragraph Font"/>
@@ -1293,6 +1543,18 @@
     <w:rPr>
       <w:sz w:val="18"/>
       <w:szCs w:val="18"/>
+    </w:rPr>
+  </w:style>
+  <w:style w:type="character" w:customStyle="1" w:styleId="10">
+    <w:name w:val="标题 1 字符"/>
+    <w:basedOn w:val="a0"/>
+    <w:link w:val="1"/>
+    <w:uiPriority w:val="9"/>
+    <w:rsid w:val="00D124F9"/>
+    <w:rPr>
+      <w:rFonts w:ascii="黑体" w:eastAsia="黑体" w:hAnsi="黑体"/>
+      <w:sz w:val="28"/>
+      <w:szCs w:val="32"/>
     </w:rPr>
   </w:style>
 </w:styles>

</xml_diff>